<commit_message>
Trim repo to deliverable files; remove pipeline scripts and leaked token file; update docs
</commit_message>
<xml_diff>
--- a/docs/PROJECT_WALKTHROUGH.docx
+++ b/docs/PROJECT_WALKTHROUGH.docx
@@ -711,48 +711,22 @@
         <w:pStyle w:val="Heading2"/>
       </w:pPr>
       <w:r>
-        <w:t>2.2 Pipeline</w:t>
+        <w:t>2.2 How the dataset was built</w:t>
       </w:r>
     </w:p>
     <w:p>
       <w:r>
-        <w:t xml:space="preserve">Scripts in </w:t>
-      </w:r>
-      <w:r>
-        <w:rPr>
-          <w:rFonts w:ascii="Consolas" w:hAnsi="Consolas"/>
-          <w:sz w:val="20"/>
-        </w:rPr>
-        <w:t>ml/scripts/</w:t>
-      </w:r>
-      <w:r>
-        <w:t>, run in order:</w:t>
+        <w:t>Each source is downloaded, parsed into a common schema, merged, schema-validated,</w:t>
       </w:r>
     </w:p>
     <w:p>
       <w:r>
-        <w:rPr>
-          <w:rFonts w:ascii="Consolas" w:hAnsi="Consolas"/>
-          <w:sz w:val="18"/>
-        </w:rPr>
-        <w:t>01_download_public.py     fetch UCI (auto)</w:t>
-        <w:br/>
-        <w:t>07_scrape_regional.py     harvest the regional news stream</w:t>
-        <w:br/>
-        <w:t>07b_ingest_extra_public.py   parse Nazario mbox + Mendeley + MOZ into JSONL</w:t>
-        <w:br/>
-        <w:t>02_normalise.py           merge all sources → schema-validate → dedup → length-filter</w:t>
-        <w:br/>
-        <w:t xml:space="preserve">                          (scaled near-duplicate detection via Jaccard size-banding)</w:t>
-        <w:br/>
-        <w:t>08_build_worklist.py      prioritise + suggest labels (source-aware)</w:t>
-        <w:br/>
-        <w:t>10_build_demo_dataset.py  assemble the labelled demo dataset</w:t>
+        <w:t>de-duplicated (exact + near-duplicate via Jaccard size-banding), length-filtered, and</w:t>
       </w:r>
     </w:p>
     <w:p>
       <w:r>
-        <w:t xml:space="preserve">After normalisation the pooled corpus is </w:t>
+        <w:t xml:space="preserve">labelled. The pooled corpus is </w:t>
       </w:r>
       <w:r>
         <w:rPr>
@@ -761,7 +735,7 @@
         <w:t>8,536</w:t>
       </w:r>
       <w:r>
-        <w:t xml:space="preserve"> unique messages. The demo training set</w:t>
+        <w:t xml:space="preserve"> unique messages; the demo training set</w:t>
       </w:r>
     </w:p>
     <w:p>
@@ -774,6 +748,15 @@
           <w:sz w:val="20"/>
         </w:rPr>
         <w:t>ml/data/labelled/demo_labeled.jsonl</w:t>
+      </w:r>
+      <w:r>
+        <w:t xml:space="preserve">, </w:t>
+      </w:r>
+      <w:r>
+        <w:rPr>
+          <w:b/>
+        </w:rPr>
+        <w:t>committed in this repo</w:t>
       </w:r>
       <w:r>
         <w:t xml:space="preserve">) is </w:t>
@@ -918,54 +901,17 @@
     <w:p/>
     <w:p>
       <w:r>
-        <w:t>Languages: English (3,885) + Portuguese (537). The κ-audit tooling for the final corpus</w:t>
+        <w:t>Languages: English (3,885) + Portuguese (537). The full corpus-construction pipeline</w:t>
       </w:r>
     </w:p>
     <w:p>
       <w:r>
-        <w:t>(</w:t>
-      </w:r>
-      <w:r>
-        <w:rPr>
-          <w:rFonts w:ascii="Consolas" w:hAnsi="Consolas"/>
-          <w:sz w:val="20"/>
-        </w:rPr>
-        <w:t>03b_assisted_label.py</w:t>
-      </w:r>
-      <w:r>
-        <w:t xml:space="preserve">, </w:t>
-      </w:r>
-      <w:r>
-        <w:rPr>
-          <w:rFonts w:ascii="Consolas" w:hAnsi="Consolas"/>
-          <w:sz w:val="20"/>
-        </w:rPr>
-        <w:t>04_create_audit_sample.py</w:t>
-      </w:r>
-      <w:r>
-        <w:t xml:space="preserve">, </w:t>
-      </w:r>
-      <w:r>
-        <w:rPr>
-          <w:rFonts w:ascii="Consolas" w:hAnsi="Consolas"/>
-          <w:sz w:val="20"/>
-        </w:rPr>
-        <w:t>05_compute_kappa.py</w:t>
-      </w:r>
-      <w:r>
-        <w:t>,</w:t>
+        <w:t>(scrapers, normaliser, and the κ-audit tooling for the final human-verified corpus) lives</w:t>
       </w:r>
     </w:p>
     <w:p>
       <w:r>
-        <w:rPr>
-          <w:rFonts w:ascii="Consolas" w:hAnsi="Consolas"/>
-          <w:sz w:val="20"/>
-        </w:rPr>
-        <w:t>06_split.py</w:t>
-      </w:r>
-      <w:r>
-        <w:t>) is in the repo but not part of this initial model.</w:t>
+        <w:t>in the separate research workspace; this demo repo ships only the assembled dataset.</w:t>
       </w:r>
     </w:p>
     <w:p>
@@ -1595,11 +1541,7 @@
         <w:br/>
         <w:t>├── src/demo_model.py              TF-IDF + LogReg / RandomForest pipelines</w:t>
         <w:br/>
-        <w:t>├── src/{schema,taxonomy,loaders,scrapers,labelling,auto_label}.py</w:t>
-        <w:br/>
         <w:t>├── serve/app.py                   FastAPI app (Swagger UI)</w:t>
-        <w:br/>
-        <w:t>├── scripts/                       data pipeline 01..10 + κ-audit tooling</w:t>
         <w:br/>
         <w:t>├── data/labelled/demo_labeled.jsonl   the 4,422-row labelled dataset</w:t>
         <w:br/>
@@ -1614,6 +1556,8 @@
         <w:t>docs/</w:t>
         <w:br/>
         <w:t>├── PROJECT_WALKTHROUGH.md         this file</w:t>
+        <w:br/>
+        <w:t>├── PROJECT_WALKTHROUGH.docx       Word version</w:t>
         <w:br/>
         <w:t>└── screens/                       interface screenshots</w:t>
         <w:br/>

</xml_diff>